<commit_message>
Added a new lesson(9.1)
</commit_message>
<xml_diff>
--- a/ML Roadmap(RU).docx
+++ b/ML Roadmap(RU).docx
@@ -11987,12 +11987,9 @@
       <w:r>
         <w:rPr>
           <w:color w:val="000000" w:themeColor="text1"/>
-          <w:lang w:val="en-US"/>
         </w:rPr>
         <w:t>8</w:t>
       </w:r>
-      <w:bookmarkStart w:id="0" w:name="_GoBack"/>
-      <w:bookmarkEnd w:id="0"/>
       <w:r>
         <w:rPr>
           <w:color w:val="000000" w:themeColor="text1"/>
@@ -12328,21 +12325,21 @@
         <w:rPr>
           <w:color w:val="000000" w:themeColor="text1"/>
         </w:rPr>
-        <w:t xml:space="preserve">ШАГ 9: Векторизация текста и </w:t>
-      </w:r>
-      <w:proofErr w:type="gramStart"/>
-      <w:r>
-        <w:rPr>
-          <w:color w:val="000000" w:themeColor="text1"/>
-        </w:rPr>
-        <w:t>классический</w:t>
-      </w:r>
-      <w:proofErr w:type="gramEnd"/>
-      <w:r>
-        <w:rPr>
-          <w:color w:val="000000" w:themeColor="text1"/>
-        </w:rPr>
-        <w:t xml:space="preserve"> NLP (~6.5 часов)</w:t>
+        <w:t>ШАГ 9: Векторизац</w:t>
+      </w:r>
+      <w:r>
+        <w:rPr>
+          <w:color w:val="000000" w:themeColor="text1"/>
+        </w:rPr>
+        <w:t>ия текста и классический NLP (~12</w:t>
+      </w:r>
+      <w:bookmarkStart w:id="0" w:name="_GoBack"/>
+      <w:bookmarkEnd w:id="0"/>
+      <w:r>
+        <w:rPr>
+          <w:color w:val="000000" w:themeColor="text1"/>
+        </w:rPr>
+        <w:t>.5 часов)</w:t>
       </w:r>
     </w:p>
     <w:p>
@@ -12389,7 +12386,10 @@
       </w:r>
       <w:proofErr w:type="spellStart"/>
       <w:r>
-        <w:t>one-hot</w:t>
+        <w:t>one</w:t>
+      </w:r>
+      <w:r>
+        <w:t>-hot</w:t>
       </w:r>
       <w:proofErr w:type="spellEnd"/>
       <w:r>
@@ -12409,7 +12409,10 @@
       </w:r>
       <w:proofErr w:type="spellEnd"/>
       <w:r>
-        <w:t>, TF-IDF (2 часа)</w:t>
+        <w:t>, TF-IDF (4</w:t>
+      </w:r>
+      <w:r>
+        <w:t xml:space="preserve"> часа)</w:t>
       </w:r>
     </w:p>
     <w:p>
@@ -12484,7 +12487,13 @@
       </w:r>
       <w:proofErr w:type="spellEnd"/>
       <w:r>
-        <w:t>, геометрия векторного пространства (2.5 часа)</w:t>
+        <w:t>, геом</w:t>
+      </w:r>
+      <w:r>
+        <w:t>етрия векторного пространства (4</w:t>
+      </w:r>
+      <w:r>
+        <w:t>.5 часа)</w:t>
       </w:r>
     </w:p>
     <w:p>
@@ -12531,7 +12540,10 @@
       </w:r>
       <w:proofErr w:type="spellStart"/>
       <w:r>
-        <w:t>Regression</w:t>
+        <w:t>Regressio</w:t>
+      </w:r>
+      <w:r>
+        <w:t>n</w:t>
       </w:r>
       <w:proofErr w:type="spellEnd"/>
       <w:r>
@@ -12543,7 +12555,10 @@
       </w:r>
       <w:proofErr w:type="spellEnd"/>
       <w:r>
-        <w:t>, метрики (2 часа)</w:t>
+        <w:t>, метрики (4</w:t>
+      </w:r>
+      <w:r>
+        <w:t xml:space="preserve"> часа)</w:t>
       </w:r>
     </w:p>
     <w:p>
@@ -21239,7 +21254,7 @@
 </file>
 
 <file path=customXml/itemProps1.xml><?xml version="1.0" encoding="utf-8"?>
-<ds:datastoreItem xmlns:ds="http://schemas.openxmlformats.org/officeDocument/2006/customXml" ds:itemID="{BB773A7C-0A0A-4E08-A027-33FF3873F53B}">
+<ds:datastoreItem xmlns:ds="http://schemas.openxmlformats.org/officeDocument/2006/customXml" ds:itemID="{67272EE3-11E3-429D-B567-43042FE59665}">
   <ds:schemaRefs>
     <ds:schemaRef ds:uri="http://schemas.openxmlformats.org/officeDocument/2006/bibliography"/>
   </ds:schemaRefs>

</xml_diff>

<commit_message>
Added a new lesson(10.2)
</commit_message>
<xml_diff>
--- a/ML Roadmap(RU).docx
+++ b/ML Roadmap(RU).docx
@@ -12333,8 +12333,6 @@
         </w:rPr>
         <w:t>ия текста и классический NLP (~12</w:t>
       </w:r>
-      <w:bookmarkStart w:id="0" w:name="_GoBack"/>
-      <w:bookmarkEnd w:id="0"/>
       <w:r>
         <w:rPr>
           <w:color w:val="000000" w:themeColor="text1"/>
@@ -12572,7 +12570,21 @@
         <w:rPr>
           <w:color w:val="000000" w:themeColor="text1"/>
         </w:rPr>
-        <w:t>ШАГ 10: Последовательности и Механизм Внимания (~9.5 часов)</w:t>
+        <w:t>ШАГ 10: Последоват</w:t>
+      </w:r>
+      <w:r>
+        <w:rPr>
+          <w:color w:val="000000" w:themeColor="text1"/>
+        </w:rPr>
+        <w:t>ельности и Механизм Внимания (~12</w:t>
+      </w:r>
+      <w:bookmarkStart w:id="0" w:name="_GoBack"/>
+      <w:bookmarkEnd w:id="0"/>
+      <w:r>
+        <w:rPr>
+          <w:color w:val="000000" w:themeColor="text1"/>
+        </w:rPr>
+        <w:t>.5 часов)</w:t>
       </w:r>
     </w:p>
     <w:p>
@@ -12607,7 +12619,13 @@
       </w:r>
       <w:proofErr w:type="spellEnd"/>
       <w:r>
-        <w:t>, BPTT, проблема длинных зависимостей (1.5 часа)</w:t>
+        <w:t xml:space="preserve">, BPTT, </w:t>
+      </w:r>
+      <w:r>
+        <w:t>проблема длинных зависимостей (3</w:t>
+      </w:r>
+      <w:r>
+        <w:t>.5 часа)</w:t>
       </w:r>
     </w:p>
     <w:p>
@@ -12650,7 +12668,13 @@
       </w:r>
       <w:proofErr w:type="spellEnd"/>
       <w:r>
-        <w:t>, мотивация возникновения, отличие GRU, применимость (2 часа)</w:t>
+        <w:t>, мотивация возникновен</w:t>
+      </w:r>
+      <w:r>
+        <w:t>ия, отличие GRU, применимость (4</w:t>
+      </w:r>
+      <w:r>
+        <w:t xml:space="preserve"> часа)</w:t>
       </w:r>
     </w:p>
     <w:p>
@@ -12706,7 +12730,25 @@
         <w:rPr>
           <w:lang w:val="en-US"/>
         </w:rPr>
-        <w:t xml:space="preserve">, scaled dot-product attention (3 </w:t>
+        <w:t>,</w:t>
+      </w:r>
+      <w:r>
+        <w:rPr>
+          <w:lang w:val="en-US"/>
+        </w:rPr>
+        <w:t xml:space="preserve"> scaled dot-product attention (</w:t>
+      </w:r>
+      <w:r>
+        <w:rPr>
+          <w:lang w:val="en-US"/>
+        </w:rPr>
+        <w:t>5</w:t>
+      </w:r>
+      <w:r>
+        <w:rPr>
+          <w:lang w:val="en-US"/>
+        </w:rPr>
+        <w:t xml:space="preserve"> </w:t>
       </w:r>
       <w:r>
         <w:t>часа</w:t>
@@ -12720,6 +12762,7 @@
     </w:p>
     <w:p>
       <w:pPr>
+        <w:pStyle w:val="1"/>
         <w:rPr>
           <w:color w:val="000000" w:themeColor="text1"/>
         </w:rPr>
@@ -12729,76 +12772,6 @@
           <w:color w:val="000000" w:themeColor="text1"/>
         </w:rPr>
         <w:lastRenderedPageBreak/>
-        <w:t xml:space="preserve">Урок 10.4: </w:t>
-      </w:r>
-      <w:proofErr w:type="spellStart"/>
-      <w:r>
-        <w:rPr>
-          <w:color w:val="000000" w:themeColor="text1"/>
-        </w:rPr>
-        <w:t>Self-Attention</w:t>
-      </w:r>
-      <w:proofErr w:type="spellEnd"/>
-      <w:r>
-        <w:rPr>
-          <w:color w:val="000000" w:themeColor="text1"/>
-        </w:rPr>
-        <w:t xml:space="preserve"> на практике — реализация </w:t>
-      </w:r>
-      <w:proofErr w:type="spellStart"/>
-      <w:r>
-        <w:rPr>
-          <w:color w:val="000000" w:themeColor="text1"/>
-        </w:rPr>
-        <w:t>attention</w:t>
-      </w:r>
-      <w:proofErr w:type="spellEnd"/>
-      <w:r>
-        <w:rPr>
-          <w:color w:val="000000" w:themeColor="text1"/>
-        </w:rPr>
-        <w:t xml:space="preserve"> в </w:t>
-      </w:r>
-      <w:proofErr w:type="spellStart"/>
-      <w:r>
-        <w:rPr>
-          <w:color w:val="000000" w:themeColor="text1"/>
-        </w:rPr>
-        <w:t>PyTorch</w:t>
-      </w:r>
-      <w:proofErr w:type="spellEnd"/>
-      <w:r>
-        <w:rPr>
-          <w:color w:val="000000" w:themeColor="text1"/>
-        </w:rPr>
-        <w:t xml:space="preserve"> с нуля, размеры тензоров, </w:t>
-      </w:r>
-      <w:proofErr w:type="spellStart"/>
-      <w:r>
-        <w:rPr>
-          <w:color w:val="000000" w:themeColor="text1"/>
-        </w:rPr>
-        <w:t>masking</w:t>
-      </w:r>
-      <w:proofErr w:type="spellEnd"/>
-      <w:r>
-        <w:rPr>
-          <w:color w:val="000000" w:themeColor="text1"/>
-        </w:rPr>
-        <w:t xml:space="preserve"> (3 часа)</w:t>
-      </w:r>
-    </w:p>
-    <w:p>
-      <w:pPr>
-        <w:pStyle w:val="1"/>
-        <w:rPr>
-          <w:color w:val="000000" w:themeColor="text1"/>
-        </w:rPr>
-      </w:pPr>
-      <w:r>
-        <w:rPr>
-          <w:color w:val="000000" w:themeColor="text1"/>
-        </w:rPr>
         <w:t xml:space="preserve">ШАГ 11: Архитектура </w:t>
       </w:r>
       <w:proofErr w:type="spellStart"/>
@@ -21254,7 +21227,7 @@
 </file>
 
 <file path=customXml/itemProps1.xml><?xml version="1.0" encoding="utf-8"?>
-<ds:datastoreItem xmlns:ds="http://schemas.openxmlformats.org/officeDocument/2006/customXml" ds:itemID="{67272EE3-11E3-429D-B567-43042FE59665}">
+<ds:datastoreItem xmlns:ds="http://schemas.openxmlformats.org/officeDocument/2006/customXml" ds:itemID="{B4FBB6EA-9D6A-41B1-98F7-8290D64CAEDC}">
   <ds:schemaRefs>
     <ds:schemaRef ds:uri="http://schemas.openxmlformats.org/officeDocument/2006/bibliography"/>
   </ds:schemaRefs>

</xml_diff>